<commit_message>
Regenera .docx a partir dos .md atuais e adiciona RAC-FRUKI01-002.docx
Sincroniza todos os .docx de processos, organizacionais e registros (PROFARMA e
Fruki) com a versão atual dos .md, refletindo as atualizações recentes (campo
Responsável, MAPA-ORG-001, REG-CAP-*, REG-OSW-001). Gera o .docx que faltava
para RAC-FRUKI01-002. Ignora artefatos de build (_export/, __pycache__).

https://claude.ai/code/session_011KXfcc9u9SbkrrmomU4zNq
</commit_message>
<xml_diff>
--- a/mps-nivel-c/oficial/00_governanca/ATA-GPC-001_Reuniao-Analise-Critica-de-Processos.docx
+++ b/mps-nivel-c/oficial/00_governanca/ATA-GPC-001_Reuniao-Analise-Critica-de-Processos.docx
@@ -34,7 +34,7 @@
           <w:color w:val="555555"/>
           <w:sz w:val="20"/>
         </w:rPr>
-        <w:t>ATA-GPC-001   ·   Versão Data   ·   11/06/2026   ·   Timeware Brasil</w:t>
+        <w:t>ATA-GPC-001   ·   Versão 1.0   ·   13/06/2026   ·   Timeware Brasil</w:t>
       </w:r>
     </w:p>
     <w:p>
@@ -451,6 +451,62 @@
                 <w:sz w:val="20"/>
               </w:rPr>
               <w:t>GPC (evidência — GPC 6, GPC 7) / OSW (evidência — OSW 3)</w:t>
+            </w:r>
+          </w:p>
+        </w:tc>
+      </w:tr>
+      <w:tr>
+        <w:trPr>
+          <w:cantSplit w:val="1"/>
+        </w:trPr>
+        <w:tc>
+          <w:tcPr>
+            <w:tcW w:type="dxa" w:w="4451"/>
+            <w:tcMar>
+              <w:top w:w="60" w:type="dxa"/>
+              <w:bottom w:w="60" w:type="dxa"/>
+              <w:left w:w="100" w:type="dxa"/>
+              <w:right w:w="100" w:type="dxa"/>
+            </w:tcMar>
+            <w:shd w:val="clear" w:color="auto" w:fill="F0F4F8"/>
+          </w:tcPr>
+          <w:p>
+            <w:pPr>
+              <w:spacing w:before="40" w:after="40"/>
+            </w:pPr>
+            <w:r>
+              <w:rPr>
+                <w:rFonts w:ascii="Calibri" w:hAnsi="Calibri"/>
+                <w:b/>
+                <w:i w:val="0"/>
+                <w:sz w:val="20"/>
+              </w:rPr>
+              <w:t>Responsável</w:t>
+            </w:r>
+          </w:p>
+        </w:tc>
+        <w:tc>
+          <w:tcPr>
+            <w:tcW w:type="dxa" w:w="4451"/>
+            <w:tcMar>
+              <w:top w:w="60" w:type="dxa"/>
+              <w:bottom w:w="60" w:type="dxa"/>
+              <w:left w:w="100" w:type="dxa"/>
+              <w:right w:w="100" w:type="dxa"/>
+            </w:tcMar>
+          </w:tcPr>
+          <w:p>
+            <w:pPr>
+              <w:spacing w:before="40" w:after="40"/>
+            </w:pPr>
+            <w:r>
+              <w:rPr>
+                <w:rFonts w:ascii="Calibri" w:hAnsi="Calibri"/>
+                <w:b w:val="0"/>
+                <w:i w:val="0"/>
+                <w:sz w:val="20"/>
+              </w:rPr>
+              <w:t>Silvio Baroni</w:t>
             </w:r>
           </w:p>
         </w:tc>
@@ -3369,6 +3425,112 @@
                 <w:i w:val="0"/>
                 <w:sz w:val="20"/>
               </w:rPr>
+              <w:t>1.1</w:t>
+            </w:r>
+          </w:p>
+        </w:tc>
+        <w:tc>
+          <w:tcPr>
+            <w:tcW w:type="dxa" w:w="2225"/>
+            <w:tcMar>
+              <w:top w:w="60" w:type="dxa"/>
+              <w:bottom w:w="60" w:type="dxa"/>
+              <w:left w:w="100" w:type="dxa"/>
+              <w:right w:w="100" w:type="dxa"/>
+            </w:tcMar>
+          </w:tcPr>
+          <w:p>
+            <w:pPr>
+              <w:spacing w:before="40" w:after="40"/>
+            </w:pPr>
+            <w:r>
+              <w:rPr>
+                <w:rFonts w:ascii="Calibri" w:hAnsi="Calibri"/>
+                <w:b w:val="0"/>
+                <w:i w:val="0"/>
+                <w:sz w:val="20"/>
+              </w:rPr>
+              <w:t>15/06/2026</w:t>
+            </w:r>
+          </w:p>
+        </w:tc>
+        <w:tc>
+          <w:tcPr>
+            <w:tcW w:type="dxa" w:w="2225"/>
+            <w:tcMar>
+              <w:top w:w="60" w:type="dxa"/>
+              <w:bottom w:w="60" w:type="dxa"/>
+              <w:left w:w="100" w:type="dxa"/>
+              <w:right w:w="100" w:type="dxa"/>
+            </w:tcMar>
+          </w:tcPr>
+          <w:p>
+            <w:pPr>
+              <w:spacing w:before="40" w:after="40"/>
+            </w:pPr>
+            <w:r>
+              <w:rPr>
+                <w:rFonts w:ascii="Calibri" w:hAnsi="Calibri"/>
+                <w:b w:val="0"/>
+                <w:i w:val="0"/>
+                <w:sz w:val="20"/>
+              </w:rPr>
+              <w:t>Time de Melhoria Contínua</w:t>
+            </w:r>
+          </w:p>
+        </w:tc>
+        <w:tc>
+          <w:tcPr>
+            <w:tcW w:type="dxa" w:w="2225"/>
+            <w:tcMar>
+              <w:top w:w="60" w:type="dxa"/>
+              <w:bottom w:w="60" w:type="dxa"/>
+              <w:left w:w="100" w:type="dxa"/>
+              <w:right w:w="100" w:type="dxa"/>
+            </w:tcMar>
+          </w:tcPr>
+          <w:p>
+            <w:pPr>
+              <w:spacing w:before="40" w:after="40"/>
+            </w:pPr>
+            <w:r>
+              <w:rPr>
+                <w:rFonts w:ascii="Calibri" w:hAnsi="Calibri"/>
+                <w:b w:val="0"/>
+                <w:i w:val="0"/>
+                <w:sz w:val="20"/>
+              </w:rPr>
+              <w:t>Campo "Responsável" adicionado ao cabeçalho: Silvio Baroni</w:t>
+            </w:r>
+          </w:p>
+        </w:tc>
+      </w:tr>
+      <w:tr>
+        <w:trPr>
+          <w:cantSplit w:val="1"/>
+        </w:trPr>
+        <w:tc>
+          <w:tcPr>
+            <w:tcW w:type="dxa" w:w="2225"/>
+            <w:tcMar>
+              <w:top w:w="60" w:type="dxa"/>
+              <w:bottom w:w="60" w:type="dxa"/>
+              <w:left w:w="100" w:type="dxa"/>
+              <w:right w:w="100" w:type="dxa"/>
+            </w:tcMar>
+            <w:shd w:val="clear" w:color="auto" w:fill="F0F4F8"/>
+          </w:tcPr>
+          <w:p>
+            <w:pPr>
+              <w:spacing w:before="40" w:after="40"/>
+            </w:pPr>
+            <w:r>
+              <w:rPr>
+                <w:rFonts w:ascii="Calibri" w:hAnsi="Calibri"/>
+                <w:b/>
+                <w:i w:val="0"/>
+                <w:sz w:val="20"/>
+              </w:rPr>
               <w:t>1.0</w:t>
             </w:r>
           </w:p>
@@ -3489,7 +3651,7 @@
         <w:color w:val="555555"/>
         <w:sz w:val="16"/>
       </w:rPr>
-      <w:t>vData  ·  11/06/2026</w:t>
+      <w:t>v1.0  ·  13/06/2026</w:t>
     </w:r>
     <w:r>
       <w:tab/>
@@ -3551,7 +3713,7 @@
         <w:color w:val="555555"/>
         <w:sz w:val="16"/>
       </w:rPr>
-      <w:t>vData  ·  11/06/2026</w:t>
+      <w:t>v1.0  ·  13/06/2026</w:t>
     </w:r>
     <w:r>
       <w:tab/>

</xml_diff>